<commit_message>
Atualiza a documentação com os quiosques do cliente e o novo layout
- README: perfis Cliente/Fornecedor, quiosques do cliente, testes (npm test),
  contas de teste locais; corrige o bloco de código que quebrava o resto do
  arquivo, a menção a Axios e o link de clone
- Documentação oficial (.md e .docx): seção 3.1.6 Quiosques do cliente,
  telas por perfil, identidade visual, Jest na stack, versões corrigidas
  (React Native 0.81) e conclusão atualizada

Co-Authored-By: Claude Opus 5.5 <noreply@anthropic.com>
</commit_message>
<xml_diff>
--- a/docs/DOCUMENTACAO_OFICIAL_QUICKSTOCK.docx
+++ b/docs/DOCUMENTACAO_OFICIAL_QUICKSTOCK.docx
@@ -271,7 +271,7 @@
           <w:sz w:val="24"/>
           <w:szCs w:val="24"/>
         </w:rPr>
-        <w:t xml:space="preserve">O comércio de bebidas e atacado enfrenta desafios recorrentes na gestão de estoque em múltiplos pontos de venda e na reposição de mercadorias junto a distribuidoras. Processos manuais, planilhas dispersas e a falta de integração entre controle interno e compras externas dificultam a operação de bares, revendas e empreendedores que operam barraquinhas em eventos.</w:t>
+        <w:t xml:space="preserve">O comércio de bebidas e atacado enfrenta desafios recorrentes na gestão de estoque em múltiplos pontos de venda e na reposição de mercadorias junto a distribuidoras. Processos manuais, planilhas dispersas e a falta de integração entre controle interno e compras externas dificultam a operação de bares, revendas e empreendedores que operam quiosques em eventos.</w:t>
       </w:r>
     </w:p>
     <w:p>
@@ -286,7 +286,7 @@
           <w:sz w:val="24"/>
           <w:szCs w:val="24"/>
         </w:rPr>
-        <w:t xml:space="preserve">O QuickStock foi desenvolvido como resposta a esse cenário: uma solução composta por aplicativo mobile (React Native / Expo) e API REST (Spring Boot), integrados a um banco de dados PostgreSQL. O sistema permite que empresas compradoras gerenciem catálogo de produtos, barraquinhas com estoque por filial, comprem de distribuidoras via marketplace integrado, acompanhem pedidos e configurem endereços e formas de pagamento.</w:t>
+        <w:t xml:space="preserve">O QuickStock foi desenvolvido como resposta a esse cenário: uma solução composta por aplicativo mobile (React Native / Expo) e API REST (Spring Boot), integrados a um banco de dados PostgreSQL. O sistema permite que empresas compradoras gerenciem catálogo de produtos, quiosques com estoque por filial, comprem de distribuidoras via marketplace integrado, acompanhem pedidos e configurem endereços e formas de pagamento.</w:t>
       </w:r>
     </w:p>
     <w:p>
@@ -361,7 +361,7 @@
           <w:sz w:val="24"/>
           <w:szCs w:val="24"/>
         </w:rPr>
-        <w:t xml:space="preserve">• Disponibilizar CRUD de produtos, barraquinhas e estoque por ponto de venda.</w:t>
+        <w:t xml:space="preserve">• Disponibilizar CRUD de produtos, quiosques e estoque por ponto de venda.</w:t>
       </w:r>
     </w:p>
     <w:p>
@@ -377,6 +377,21 @@
           <w:szCs w:val="24"/>
         </w:rPr>
         <w:t xml:space="preserve">• Construir marketplace B2B com vitrine, sacola, checkout e rastreamento de pedidos.</w:t>
+      </w:r>
+    </w:p>
+    <w:p>
+      <w:pPr>
+        <w:spacing w:after="80" w:line="360"/>
+        <w:ind w:left="851" w:firstLine="284"/>
+        <w:jc w:val="both"/>
+      </w:pPr>
+      <w:r>
+        <w:rPr>
+          <w:rFonts w:ascii="Times New Roman" w:cs="Times New Roman" w:eastAsia="Times New Roman" w:hAnsi="Times New Roman"/>
+          <w:sz w:val="24"/>
+          <w:szCs w:val="24"/>
+        </w:rPr>
+        <w:t xml:space="preserve">• Permitir que o cliente monte quiosques próprios para eventos a partir das compras recebidas.</w:t>
       </w:r>
     </w:p>
     <w:p>
@@ -466,7 +481,7 @@
           <w:sz w:val="24"/>
           <w:szCs w:val="24"/>
         </w:rPr>
-        <w:t xml:space="preserve">Este documento abrange a arquitetura do sistema, o frontend mobile, o backend API, a modelagem conceitual, lógica e física do banco de dados, além de limitações conhecidas e referências bibliográficas. Não inclui manual de implantação em produção nem testes automatizados formais.</w:t>
+        <w:t xml:space="preserve">Este documento abrange a arquitetura do sistema, o frontend mobile, o backend API, a modelagem conceitual, lógica e física do banco de dados, além de limitações conhecidas e referências bibliográficas. Inclui testes unitários das regras de estoque dos quiosques do cliente. Não inclui manual de implantação em produção nem testes de integração ou ponta a ponta.</w:t>
       </w:r>
     </w:p>
     <w:p>
@@ -496,7 +511,7 @@
           <w:sz w:val="24"/>
           <w:szCs w:val="24"/>
         </w:rPr>
-        <w:t xml:space="preserve">O desenvolvimento seguiu abordagem incremental, com entregas por domínio funcional: autenticação, gestão interna (produtos e barraquinhas), marketplace B2B, checkout, acompanhamento de pedidos e configurações. A comunicação entre camadas utiliza HTTP/JSON na porta 8080.</w:t>
+        <w:t xml:space="preserve">O desenvolvimento seguiu abordagem incremental, com entregas por domínio funcional: autenticação, gestão interna (produtos e quiosques), marketplace B2B, checkout, acompanhamento de pedidos e configurações. A comunicação entre camadas utiliza HTTP/JSON na porta 8080.</w:t>
       </w:r>
     </w:p>
     <w:p>
@@ -650,7 +665,7 @@
                 <w:sz w:val="24"/>
                 <w:szCs w:val="24"/>
               </w:rPr>
-              <w:t xml:space="preserve">54.0.6 / 0.83.2</w:t>
+              <w:t xml:space="preserve">54 / 0.81 / 5.9</w:t>
             </w:r>
           </w:p>
         </w:tc>
@@ -887,6 +902,65 @@
                 <w:szCs w:val="24"/>
               </w:rPr>
               <w:t xml:space="preserve">0.12.6</w:t>
+            </w:r>
+          </w:p>
+        </w:tc>
+      </w:tr>
+      <w:tr>
+        <w:tc>
+          <w:tcPr>
+            <w:tcW w:type="pct" w:w="33.333333333333336%"/>
+          </w:tcPr>
+          <w:p>
+            <w:pPr>
+              <w:spacing w:after="0" w:line="360"/>
+              <w:jc w:val="both"/>
+            </w:pPr>
+            <w:r>
+              <w:rPr>
+                <w:rFonts w:ascii="Times New Roman" w:cs="Times New Roman" w:eastAsia="Times New Roman" w:hAnsi="Times New Roman"/>
+                <w:sz w:val="24"/>
+                <w:szCs w:val="24"/>
+              </w:rPr>
+              <w:t xml:space="preserve">Testes (mobile)</w:t>
+            </w:r>
+          </w:p>
+        </w:tc>
+        <w:tc>
+          <w:tcPr>
+            <w:tcW w:type="pct" w:w="33.333333333333336%"/>
+          </w:tcPr>
+          <w:p>
+            <w:pPr>
+              <w:spacing w:after="0" w:line="360"/>
+              <w:jc w:val="both"/>
+            </w:pPr>
+            <w:r>
+              <w:rPr>
+                <w:rFonts w:ascii="Times New Roman" w:cs="Times New Roman" w:eastAsia="Times New Roman" w:hAnsi="Times New Roman"/>
+                <w:sz w:val="24"/>
+                <w:szCs w:val="24"/>
+              </w:rPr>
+              <w:t xml:space="preserve">Jest + jest-expo</w:t>
+            </w:r>
+          </w:p>
+        </w:tc>
+        <w:tc>
+          <w:tcPr>
+            <w:tcW w:type="pct" w:w="33.333333333333336%"/>
+          </w:tcPr>
+          <w:p>
+            <w:pPr>
+              <w:spacing w:after="0" w:line="360"/>
+              <w:jc w:val="both"/>
+            </w:pPr>
+            <w:r>
+              <w:rPr>
+                <w:rFonts w:ascii="Times New Roman" w:cs="Times New Roman" w:eastAsia="Times New Roman" w:hAnsi="Times New Roman"/>
+                <w:sz w:val="24"/>
+                <w:szCs w:val="24"/>
+              </w:rPr>
+              <w:t xml:space="preserve">29.7 / 54</w:t>
             </w:r>
           </w:p>
         </w:tc>
@@ -1040,6 +1114,21 @@
           <w:sz w:val="24"/>
           <w:szCs w:val="24"/>
         </w:rPr>
+        <w:t xml:space="preserve">• Mobile (versão com quiosques do cliente e novo layout): https://github.com/marcelo435/Mobile</w:t>
+      </w:r>
+    </w:p>
+    <w:p>
+      <w:pPr>
+        <w:spacing w:after="80" w:line="360"/>
+        <w:ind w:left="851" w:firstLine="284"/>
+        <w:jc w:val="both"/>
+      </w:pPr>
+      <w:r>
+        <w:rPr>
+          <w:rFonts w:ascii="Times New Roman" w:cs="Times New Roman" w:eastAsia="Times New Roman" w:hAnsi="Times New Roman"/>
+          <w:sz w:val="24"/>
+          <w:szCs w:val="24"/>
+        </w:rPr>
         <w:t xml:space="preserve">• BackEnd: https://github.com/LuanSantos26/QuickStock-BackEnd</w:t>
       </w:r>
     </w:p>
@@ -1085,7 +1174,7 @@
           <w:sz w:val="24"/>
           <w:szCs w:val="24"/>
         </w:rPr>
-        <w:t xml:space="preserve">O frontend QuickStock é um aplicativo Expo 54 com React Native 0.83 e TypeScript. A navegação utiliza React Navigation (Native Stack) com gate de autenticação: usuários não autenticados acessam Welcome, Login e Register; autenticados acessam o stack principal com Home, marketplace, sacola e demais telas.</w:t>
+        <w:t xml:space="preserve">O frontend QuickStock é um aplicativo Expo 54 com React Native 0.81 e TypeScript. A navegação utiliza React Navigation (Native Stack) com gate de autenticação: usuários não autenticados acessam Welcome, Login e Register; autenticados acessam o stack principal. O app atende dois perfis, escolhidos no cadastro: Cliente (comerciante que compra de fornecedores) e Fornecedor (distribuidora que vende e gerencia o catálogo). Cada perfil tem telas e barra inferior próprias, com o mesmo layout e cores diferentes.</w:t>
       </w:r>
     </w:p>
     <w:p>
@@ -1278,7 +1367,7 @@
                 <w:sz w:val="24"/>
                 <w:szCs w:val="24"/>
               </w:rPr>
-              <w:t xml:space="preserve">Estado global (Auth, Products, Barraquinhas, PurchaseCart)</w:t>
+              <w:t xml:space="preserve">Estado global (Auth, Products, Quiosque, PurchaseCart)</w:t>
             </w:r>
           </w:p>
         </w:tc>
@@ -1379,6 +1468,86 @@
                 <w:sz w:val="24"/>
                 <w:szCs w:val="24"/>
               </w:rPr>
+              <w:t xml:space="preserve">src/navigation/</w:t>
+            </w:r>
+          </w:p>
+        </w:tc>
+        <w:tc>
+          <w:tcPr>
+            <w:tcW w:type="pct" w:w="50%"/>
+          </w:tcPr>
+          <w:p>
+            <w:pPr>
+              <w:spacing w:after="0" w:line="360"/>
+              <w:jc w:val="both"/>
+            </w:pPr>
+            <w:r>
+              <w:rPr>
+                <w:rFonts w:ascii="Times New Roman" w:cs="Times New Roman" w:eastAsia="Times New Roman" w:hAnsi="Times New Roman"/>
+                <w:sz w:val="24"/>
+                <w:szCs w:val="24"/>
+              </w:rPr>
+              <w:t xml:space="preserve">Rotas de autenticação e principais, e tipos das rotas</w:t>
+            </w:r>
+          </w:p>
+        </w:tc>
+      </w:tr>
+      <w:tr>
+        <w:tc>
+          <w:tcPr>
+            <w:tcW w:type="pct" w:w="50%"/>
+          </w:tcPr>
+          <w:p>
+            <w:pPr>
+              <w:spacing w:after="0" w:line="360"/>
+              <w:jc w:val="both"/>
+            </w:pPr>
+            <w:r>
+              <w:rPr>
+                <w:rFonts w:ascii="Times New Roman" w:cs="Times New Roman" w:eastAsia="Times New Roman" w:hAnsi="Times New Roman"/>
+                <w:sz w:val="24"/>
+                <w:szCs w:val="24"/>
+              </w:rPr>
+              <w:t xml:space="preserve">src/utils/</w:t>
+            </w:r>
+          </w:p>
+        </w:tc>
+        <w:tc>
+          <w:tcPr>
+            <w:tcW w:type="pct" w:w="50%"/>
+          </w:tcPr>
+          <w:p>
+            <w:pPr>
+              <w:spacing w:after="0" w:line="360"/>
+              <w:jc w:val="both"/>
+            </w:pPr>
+            <w:r>
+              <w:rPr>
+                <w:rFonts w:ascii="Times New Roman" w:cs="Times New Roman" w:eastAsia="Times New Roman" w:hAnsi="Times New Roman"/>
+                <w:sz w:val="24"/>
+                <w:szCs w:val="24"/>
+              </w:rPr>
+              <w:t xml:space="preserve">Funções puras (regras de estoque dos quiosques, máscaras, datas) e testes em __tests__/</w:t>
+            </w:r>
+          </w:p>
+        </w:tc>
+      </w:tr>
+      <w:tr>
+        <w:tc>
+          <w:tcPr>
+            <w:tcW w:type="pct" w:w="50%"/>
+          </w:tcPr>
+          <w:p>
+            <w:pPr>
+              <w:spacing w:after="0" w:line="360"/>
+              <w:jc w:val="both"/>
+            </w:pPr>
+            <w:r>
+              <w:rPr>
+                <w:rFonts w:ascii="Times New Roman" w:cs="Times New Roman" w:eastAsia="Times New Roman" w:hAnsi="Times New Roman"/>
+                <w:sz w:val="24"/>
+                <w:szCs w:val="24"/>
+              </w:rPr>
               <w:t xml:space="preserve">src/theme/theme.ts</w:t>
             </w:r>
           </w:p>
@@ -1398,7 +1567,7 @@
                 <w:sz w:val="24"/>
                 <w:szCs w:val="24"/>
               </w:rPr>
-              <w:t xml:space="preserve">Cores, fontes e espaçamentos</w:t>
+              <w:t xml:space="preserve">Paletas por perfil (CLIENTE_COLORS, COMPANY_COLORS), fontes e espaçamentos</w:t>
             </w:r>
           </w:p>
         </w:tc>
@@ -1589,7 +1758,7 @@
                 <w:sz w:val="24"/>
                 <w:szCs w:val="24"/>
               </w:rPr>
-              <w:t xml:space="preserve">BarraquinhasContext</w:t>
+              <w:t xml:space="preserve">QuiosqueContext</w:t>
             </w:r>
           </w:p>
         </w:tc>
@@ -1608,7 +1777,7 @@
                 <w:sz w:val="24"/>
                 <w:szCs w:val="24"/>
               </w:rPr>
-              <w:t xml:space="preserve">Barraquinhas/filiais da empresa</w:t>
+              <w:t xml:space="preserve">Quiosques da empresa logada (fornecedor ou cliente)</w:t>
             </w:r>
           </w:p>
         </w:tc>
@@ -1649,6 +1818,46 @@
                 <w:szCs w:val="24"/>
               </w:rPr>
               <w:t xml:space="preserve">Sacola B2B (um fornecedor por vez)</w:t>
+            </w:r>
+          </w:p>
+        </w:tc>
+      </w:tr>
+      <w:tr>
+        <w:tc>
+          <w:tcPr>
+            <w:tcW w:type="pct" w:w="50%"/>
+          </w:tcPr>
+          <w:p>
+            <w:pPr>
+              <w:spacing w:after="0" w:line="360"/>
+              <w:jc w:val="both"/>
+            </w:pPr>
+            <w:r>
+              <w:rPr>
+                <w:rFonts w:ascii="Times New Roman" w:cs="Times New Roman" w:eastAsia="Times New Roman" w:hAnsi="Times New Roman"/>
+                <w:sz w:val="24"/>
+                <w:szCs w:val="24"/>
+              </w:rPr>
+              <w:t xml:space="preserve">ConfirmDialogContext</w:t>
+            </w:r>
+          </w:p>
+        </w:tc>
+        <w:tc>
+          <w:tcPr>
+            <w:tcW w:type="pct" w:w="50%"/>
+          </w:tcPr>
+          <w:p>
+            <w:pPr>
+              <w:spacing w:after="0" w:line="360"/>
+              <w:jc w:val="both"/>
+            </w:pPr>
+            <w:r>
+              <w:rPr>
+                <w:rFonts w:ascii="Times New Roman" w:cs="Times New Roman" w:eastAsia="Times New Roman" w:hAnsi="Times New Roman"/>
+                <w:sz w:val="24"/>
+                <w:szCs w:val="24"/>
+              </w:rPr>
+              <w:t xml:space="preserve">Diálogo de confirmação reutilizável (ex.: excluir quiosque)</w:t>
             </w:r>
           </w:p>
         </w:tc>
@@ -1683,6 +1892,20 @@
         <w:t xml:space="preserve">3.1.3 Telas principais</w:t>
       </w:r>
     </w:p>
+    <w:p>
+      <w:pPr>
+        <w:spacing w:after="80" w:line="360"/>
+        <w:jc w:val="both"/>
+      </w:pPr>
+      <w:r>
+        <w:rPr>
+          <w:rFonts w:ascii="Times New Roman" w:cs="Times New Roman" w:eastAsia="Times New Roman" w:hAnsi="Times New Roman"/>
+          <w:sz w:val="24"/>
+          <w:szCs w:val="24"/>
+        </w:rPr>
+        <w:t xml:space="preserve">Telas do perfil Fornecedor:</w:t>
+      </w:r>
+    </w:p>
     <w:tbl>
       <w:tblPr>
         <w:tblW w:type="pct" w:w="100%"/>
@@ -1819,7 +2042,7 @@
                 <w:sz w:val="24"/>
                 <w:szCs w:val="24"/>
               </w:rPr>
-              <w:t xml:space="preserve">Acesso e cadastro unificado</w:t>
+              <w:t xml:space="preserve">Acesso, cadastro unificado e escolha de perfil</w:t>
             </w:r>
           </w:p>
         </w:tc>
@@ -1859,7 +2082,7 @@
                 <w:sz w:val="24"/>
                 <w:szCs w:val="24"/>
               </w:rPr>
-              <w:t xml:space="preserve">Dashboard</w:t>
+              <w:t xml:space="preserve">Início</w:t>
             </w:r>
           </w:p>
         </w:tc>
@@ -1878,7 +2101,7 @@
                 <w:sz w:val="24"/>
                 <w:szCs w:val="24"/>
               </w:rPr>
-              <w:t xml:space="preserve">Catálogo próprio e resumo visual</w:t>
+              <w:t xml:space="preserve">Saudação, estoque, ações rápidas e resumo financeiro</w:t>
             </w:r>
           </w:p>
         </w:tc>
@@ -1899,7 +2122,7 @@
                 <w:sz w:val="24"/>
                 <w:szCs w:val="24"/>
               </w:rPr>
-              <w:t xml:space="preserve">Cart</w:t>
+              <w:t xml:space="preserve">Quiosque</w:t>
             </w:r>
           </w:p>
         </w:tc>
@@ -1918,7 +2141,7 @@
                 <w:sz w:val="24"/>
                 <w:szCs w:val="24"/>
               </w:rPr>
-              <w:t xml:space="preserve">Marketplace</w:t>
+              <w:t xml:space="preserve">Quiosques</w:t>
             </w:r>
           </w:p>
         </w:tc>
@@ -1937,7 +2160,7 @@
                 <w:sz w:val="24"/>
                 <w:szCs w:val="24"/>
               </w:rPr>
-              <w:t xml:space="preserve">Lista de distribuidoras e pedidos recentes</w:t>
+              <w:t xml:space="preserve">CRUD de pontos de venda e estoque</w:t>
             </w:r>
           </w:p>
         </w:tc>
@@ -1958,7 +2181,7 @@
                 <w:sz w:val="24"/>
                 <w:szCs w:val="24"/>
               </w:rPr>
-              <w:t xml:space="preserve">StoreVitrine</w:t>
+              <w:t xml:space="preserve">AddItem</w:t>
             </w:r>
           </w:p>
         </w:tc>
@@ -1977,7 +2200,7 @@
                 <w:sz w:val="24"/>
                 <w:szCs w:val="24"/>
               </w:rPr>
-              <w:t xml:space="preserve">Vitrine</w:t>
+              <w:t xml:space="preserve">Produtos</w:t>
             </w:r>
           </w:p>
         </w:tc>
@@ -1996,7 +2219,7 @@
                 <w:sz w:val="24"/>
                 <w:szCs w:val="24"/>
               </w:rPr>
-              <w:t xml:space="preserve">Produtos de um fornecedor</w:t>
+              <w:t xml:space="preserve">CRUD do catálogo</w:t>
             </w:r>
           </w:p>
         </w:tc>
@@ -2017,7 +2240,7 @@
                 <w:sz w:val="24"/>
                 <w:szCs w:val="24"/>
               </w:rPr>
-              <w:t xml:space="preserve">ProductDetail</w:t>
+              <w:t xml:space="preserve">EmpresaVendas / EmpresaGraficos</w:t>
             </w:r>
           </w:p>
         </w:tc>
@@ -2036,7 +2259,7 @@
                 <w:sz w:val="24"/>
                 <w:szCs w:val="24"/>
               </w:rPr>
-              <w:t xml:space="preserve">Detalhe</w:t>
+              <w:t xml:space="preserve">Vendas</w:t>
             </w:r>
           </w:p>
         </w:tc>
@@ -2055,7 +2278,7 @@
                 <w:sz w:val="24"/>
                 <w:szCs w:val="24"/>
               </w:rPr>
-              <w:t xml:space="preserve">Quantidade e adição à sacola</w:t>
+              <w:t xml:space="preserve">Resumo de vendas e gráficos</w:t>
             </w:r>
           </w:p>
         </w:tc>
@@ -2076,7 +2299,7 @@
                 <w:sz w:val="24"/>
                 <w:szCs w:val="24"/>
               </w:rPr>
-              <w:t xml:space="preserve">Sacola</w:t>
+              <w:t xml:space="preserve">Configuracoes</w:t>
             </w:r>
           </w:p>
         </w:tc>
@@ -2095,7 +2318,7 @@
                 <w:sz w:val="24"/>
                 <w:szCs w:val="24"/>
               </w:rPr>
-              <w:t xml:space="preserve">Checkout</w:t>
+              <w:t xml:space="preserve">Ajustes</w:t>
             </w:r>
           </w:p>
         </w:tc>
@@ -2114,7 +2337,7 @@
                 <w:sz w:val="24"/>
                 <w:szCs w:val="24"/>
               </w:rPr>
-              <w:t xml:space="preserve">Endereço, pagamento e finalização</w:t>
+              <w:t xml:space="preserve">Edição de usuário, senha e empresa</w:t>
             </w:r>
           </w:p>
         </w:tc>
@@ -2135,6 +2358,124 @@
                 <w:sz w:val="24"/>
                 <w:szCs w:val="24"/>
               </w:rPr>
+              <w:t xml:space="preserve">Logistica / Camioneiros / CadastroCamioneiros</w:t>
+            </w:r>
+          </w:p>
+        </w:tc>
+        <w:tc>
+          <w:tcPr>
+            <w:tcW w:type="pct" w:w="33.333333333333336%"/>
+          </w:tcPr>
+          <w:p>
+            <w:pPr>
+              <w:spacing w:after="0" w:line="360"/>
+              <w:jc w:val="both"/>
+            </w:pPr>
+            <w:r>
+              <w:rPr>
+                <w:rFonts w:ascii="Times New Roman" w:cs="Times New Roman" w:eastAsia="Times New Roman" w:hAnsi="Times New Roman"/>
+                <w:sz w:val="24"/>
+                <w:szCs w:val="24"/>
+              </w:rPr>
+              <w:t xml:space="preserve">Logística</w:t>
+            </w:r>
+          </w:p>
+        </w:tc>
+        <w:tc>
+          <w:tcPr>
+            <w:tcW w:type="pct" w:w="33.333333333333336%"/>
+          </w:tcPr>
+          <w:p>
+            <w:pPr>
+              <w:spacing w:after="0" w:line="360"/>
+              <w:jc w:val="both"/>
+            </w:pPr>
+            <w:r>
+              <w:rPr>
+                <w:rFonts w:ascii="Times New Roman" w:cs="Times New Roman" w:eastAsia="Times New Roman" w:hAnsi="Times New Roman"/>
+                <w:sz w:val="24"/>
+                <w:szCs w:val="24"/>
+              </w:rPr>
+              <w:t xml:space="preserve">Entregas e caminhoneiros</w:t>
+            </w:r>
+          </w:p>
+        </w:tc>
+      </w:tr>
+      <w:tr>
+        <w:tc>
+          <w:tcPr>
+            <w:tcW w:type="pct" w:w="33.333333333333336%"/>
+          </w:tcPr>
+          <w:p>
+            <w:pPr>
+              <w:spacing w:after="0" w:line="360"/>
+              <w:jc w:val="both"/>
+            </w:pPr>
+            <w:r>
+              <w:rPr>
+                <w:rFonts w:ascii="Times New Roman" w:cs="Times New Roman" w:eastAsia="Times New Roman" w:hAnsi="Times New Roman"/>
+                <w:sz w:val="24"/>
+                <w:szCs w:val="24"/>
+              </w:rPr>
+              <w:t xml:space="preserve">Cart / StoreVitrine / ProductDetail / Sacola</w:t>
+            </w:r>
+          </w:p>
+        </w:tc>
+        <w:tc>
+          <w:tcPr>
+            <w:tcW w:type="pct" w:w="33.333333333333336%"/>
+          </w:tcPr>
+          <w:p>
+            <w:pPr>
+              <w:spacing w:after="0" w:line="360"/>
+              <w:jc w:val="both"/>
+            </w:pPr>
+            <w:r>
+              <w:rPr>
+                <w:rFonts w:ascii="Times New Roman" w:cs="Times New Roman" w:eastAsia="Times New Roman" w:hAnsi="Times New Roman"/>
+                <w:sz w:val="24"/>
+                <w:szCs w:val="24"/>
+              </w:rPr>
+              <w:t xml:space="preserve">Compra B2B</w:t>
+            </w:r>
+          </w:p>
+        </w:tc>
+        <w:tc>
+          <w:tcPr>
+            <w:tcW w:type="pct" w:w="33.333333333333336%"/>
+          </w:tcPr>
+          <w:p>
+            <w:pPr>
+              <w:spacing w:after="0" w:line="360"/>
+              <w:jc w:val="both"/>
+            </w:pPr>
+            <w:r>
+              <w:rPr>
+                <w:rFonts w:ascii="Times New Roman" w:cs="Times New Roman" w:eastAsia="Times New Roman" w:hAnsi="Times New Roman"/>
+                <w:sz w:val="24"/>
+                <w:szCs w:val="24"/>
+              </w:rPr>
+              <w:t xml:space="preserve">Marketplace, vitrine, detalhe e checkout</w:t>
+            </w:r>
+          </w:p>
+        </w:tc>
+      </w:tr>
+      <w:tr>
+        <w:tc>
+          <w:tcPr>
+            <w:tcW w:type="pct" w:w="33.333333333333336%"/>
+          </w:tcPr>
+          <w:p>
+            <w:pPr>
+              <w:spacing w:after="0" w:line="360"/>
+              <w:jc w:val="both"/>
+            </w:pPr>
+            <w:r>
+              <w:rPr>
+                <w:rFonts w:ascii="Times New Roman" w:cs="Times New Roman" w:eastAsia="Times New Roman" w:hAnsi="Times New Roman"/>
+                <w:sz w:val="24"/>
+                <w:szCs w:val="24"/>
+              </w:rPr>
               <w:t xml:space="preserve">PedidoAcompanhamento</w:t>
             </w:r>
           </w:p>
@@ -2194,7 +2535,7 @@
                 <w:sz w:val="24"/>
                 <w:szCs w:val="24"/>
               </w:rPr>
-              <w:t xml:space="preserve">AddItem</w:t>
+              <w:t xml:space="preserve">Cards / FormasPagamento / Enderecos</w:t>
             </w:r>
           </w:p>
         </w:tc>
@@ -2213,6 +2554,235 @@
                 <w:sz w:val="24"/>
                 <w:szCs w:val="24"/>
               </w:rPr>
+              <w:t xml:space="preserve">Conta</w:t>
+            </w:r>
+          </w:p>
+        </w:tc>
+        <w:tc>
+          <w:tcPr>
+            <w:tcW w:type="pct" w:w="33.333333333333336%"/>
+          </w:tcPr>
+          <w:p>
+            <w:pPr>
+              <w:spacing w:after="0" w:line="360"/>
+              <w:jc w:val="both"/>
+            </w:pPr>
+            <w:r>
+              <w:rPr>
+                <w:rFonts w:ascii="Times New Roman" w:cs="Times New Roman" w:eastAsia="Times New Roman" w:hAnsi="Times New Roman"/>
+                <w:sz w:val="24"/>
+                <w:szCs w:val="24"/>
+              </w:rPr>
+              <w:t xml:space="preserve">Financeiro, formas de pagamento e endereços</w:t>
+            </w:r>
+          </w:p>
+        </w:tc>
+      </w:tr>
+    </w:tbl>
+    <w:p>
+      <w:pPr>
+        <w:spacing w:after="200" w:line="360"/>
+        <w:jc w:val="both"/>
+      </w:pPr>
+      <w:r>
+        <w:rPr>
+          <w:rFonts w:ascii="Times New Roman" w:cs="Times New Roman" w:eastAsia="Times New Roman" w:hAnsi="Times New Roman"/>
+          <w:sz w:val="24"/>
+          <w:szCs w:val="24"/>
+        </w:rPr>
+        <w:t xml:space="preserve"/>
+      </w:r>
+    </w:p>
+    <w:p>
+      <w:pPr>
+        <w:spacing w:after="80" w:line="360"/>
+        <w:jc w:val="both"/>
+      </w:pPr>
+      <w:r>
+        <w:rPr>
+          <w:rFonts w:ascii="Times New Roman" w:cs="Times New Roman" w:eastAsia="Times New Roman" w:hAnsi="Times New Roman"/>
+          <w:sz w:val="24"/>
+          <w:szCs w:val="24"/>
+        </w:rPr>
+        <w:t xml:space="preserve">Telas do perfil Cliente:</w:t>
+      </w:r>
+    </w:p>
+    <w:tbl>
+      <w:tblPr>
+        <w:tblW w:type="pct" w:w="100%"/>
+        <w:tblBorders>
+          <w:top w:val="single" w:color="auto" w:sz="4"/>
+          <w:left w:val="single" w:color="auto" w:sz="4"/>
+          <w:bottom w:val="single" w:color="auto" w:sz="4"/>
+          <w:right w:val="single" w:color="auto" w:sz="4"/>
+          <w:insideH w:val="single" w:color="auto" w:sz="4"/>
+          <w:insideV w:val="single" w:color="auto" w:sz="4"/>
+        </w:tblBorders>
+      </w:tblPr>
+      <w:tblGrid>
+        <w:gridCol w:w="100"/>
+        <w:gridCol w:w="100"/>
+        <w:gridCol w:w="100"/>
+      </w:tblGrid>
+      <w:tr>
+        <w:tc>
+          <w:tcPr>
+            <w:tcW w:type="pct" w:w="33.333333333333336%"/>
+          </w:tcPr>
+          <w:p>
+            <w:pPr>
+              <w:spacing w:after="0" w:line="360"/>
+              <w:jc w:val="both"/>
+            </w:pPr>
+            <w:r>
+              <w:rPr>
+                <w:rFonts w:ascii="Times New Roman" w:cs="Times New Roman" w:eastAsia="Times New Roman" w:hAnsi="Times New Roman"/>
+                <w:b/>
+                <w:bCs/>
+                <w:sz w:val="24"/>
+                <w:szCs w:val="24"/>
+              </w:rPr>
+              <w:t xml:space="preserve">Rota</w:t>
+            </w:r>
+          </w:p>
+        </w:tc>
+        <w:tc>
+          <w:tcPr>
+            <w:tcW w:type="pct" w:w="33.333333333333336%"/>
+          </w:tcPr>
+          <w:p>
+            <w:pPr>
+              <w:spacing w:after="0" w:line="360"/>
+              <w:jc w:val="both"/>
+            </w:pPr>
+            <w:r>
+              <w:rPr>
+                <w:rFonts w:ascii="Times New Roman" w:cs="Times New Roman" w:eastAsia="Times New Roman" w:hAnsi="Times New Roman"/>
+                <w:b/>
+                <w:bCs/>
+                <w:sz w:val="24"/>
+                <w:szCs w:val="24"/>
+              </w:rPr>
+              <w:t xml:space="preserve">Tela</w:t>
+            </w:r>
+          </w:p>
+        </w:tc>
+        <w:tc>
+          <w:tcPr>
+            <w:tcW w:type="pct" w:w="33.333333333333336%"/>
+          </w:tcPr>
+          <w:p>
+            <w:pPr>
+              <w:spacing w:after="0" w:line="360"/>
+              <w:jc w:val="both"/>
+            </w:pPr>
+            <w:r>
+              <w:rPr>
+                <w:rFonts w:ascii="Times New Roman" w:cs="Times New Roman" w:eastAsia="Times New Roman" w:hAnsi="Times New Roman"/>
+                <w:b/>
+                <w:bCs/>
+                <w:sz w:val="24"/>
+                <w:szCs w:val="24"/>
+              </w:rPr>
+              <w:t xml:space="preserve">Função</w:t>
+            </w:r>
+          </w:p>
+        </w:tc>
+      </w:tr>
+      <w:tr>
+        <w:tc>
+          <w:tcPr>
+            <w:tcW w:type="pct" w:w="33.333333333333336%"/>
+          </w:tcPr>
+          <w:p>
+            <w:pPr>
+              <w:spacing w:after="0" w:line="360"/>
+              <w:jc w:val="both"/>
+            </w:pPr>
+            <w:r>
+              <w:rPr>
+                <w:rFonts w:ascii="Times New Roman" w:cs="Times New Roman" w:eastAsia="Times New Roman" w:hAnsi="Times New Roman"/>
+                <w:sz w:val="24"/>
+                <w:szCs w:val="24"/>
+              </w:rPr>
+              <w:t xml:space="preserve">Home</w:t>
+            </w:r>
+          </w:p>
+        </w:tc>
+        <w:tc>
+          <w:tcPr>
+            <w:tcW w:type="pct" w:w="33.333333333333336%"/>
+          </w:tcPr>
+          <w:p>
+            <w:pPr>
+              <w:spacing w:after="0" w:line="360"/>
+              <w:jc w:val="both"/>
+            </w:pPr>
+            <w:r>
+              <w:rPr>
+                <w:rFonts w:ascii="Times New Roman" w:cs="Times New Roman" w:eastAsia="Times New Roman" w:hAnsi="Times New Roman"/>
+                <w:sz w:val="24"/>
+                <w:szCs w:val="24"/>
+              </w:rPr>
+              <w:t xml:space="preserve">Início</w:t>
+            </w:r>
+          </w:p>
+        </w:tc>
+        <w:tc>
+          <w:tcPr>
+            <w:tcW w:type="pct" w:w="33.333333333333336%"/>
+          </w:tcPr>
+          <w:p>
+            <w:pPr>
+              <w:spacing w:after="0" w:line="360"/>
+              <w:jc w:val="both"/>
+            </w:pPr>
+            <w:r>
+              <w:rPr>
+                <w:rFonts w:ascii="Times New Roman" w:cs="Times New Roman" w:eastAsia="Times New Roman" w:hAnsi="Times New Roman"/>
+                <w:sz w:val="24"/>
+                <w:szCs w:val="24"/>
+              </w:rPr>
+              <w:t xml:space="preserve">Destaque, ações rápidas e quiosques disponíveis</w:t>
+            </w:r>
+          </w:p>
+        </w:tc>
+      </w:tr>
+      <w:tr>
+        <w:tc>
+          <w:tcPr>
+            <w:tcW w:type="pct" w:w="33.333333333333336%"/>
+          </w:tcPr>
+          <w:p>
+            <w:pPr>
+              <w:spacing w:after="0" w:line="360"/>
+              <w:jc w:val="both"/>
+            </w:pPr>
+            <w:r>
+              <w:rPr>
+                <w:rFonts w:ascii="Times New Roman" w:cs="Times New Roman" w:eastAsia="Times New Roman" w:hAnsi="Times New Roman"/>
+                <w:sz w:val="24"/>
+                <w:szCs w:val="24"/>
+              </w:rPr>
+              <w:t xml:space="preserve">Explorar</w:t>
+            </w:r>
+          </w:p>
+        </w:tc>
+        <w:tc>
+          <w:tcPr>
+            <w:tcW w:type="pct" w:w="33.333333333333336%"/>
+          </w:tcPr>
+          <w:p>
+            <w:pPr>
+              <w:spacing w:after="0" w:line="360"/>
+              <w:jc w:val="both"/>
+            </w:pPr>
+            <w:r>
+              <w:rPr>
+                <w:rFonts w:ascii="Times New Roman" w:cs="Times New Roman" w:eastAsia="Times New Roman" w:hAnsi="Times New Roman"/>
+                <w:sz w:val="24"/>
+                <w:szCs w:val="24"/>
+              </w:rPr>
               <w:t xml:space="preserve">Produtos</w:t>
             </w:r>
           </w:p>
@@ -2232,7 +2802,7 @@
                 <w:sz w:val="24"/>
                 <w:szCs w:val="24"/>
               </w:rPr>
-              <w:t xml:space="preserve">CRUD do catálogo (botão + central)</w:t>
+              <w:t xml:space="preserve">Categorias, produtos e quiosques de fornecedores</w:t>
             </w:r>
           </w:p>
         </w:tc>
@@ -2253,7 +2823,7 @@
                 <w:sz w:val="24"/>
                 <w:szCs w:val="24"/>
               </w:rPr>
-              <w:t xml:space="preserve">Barraquinhas</w:t>
+              <w:t xml:space="preserve">StoreVitrine / ProductDetail</w:t>
             </w:r>
           </w:p>
         </w:tc>
@@ -2272,7 +2842,7 @@
                 <w:sz w:val="24"/>
                 <w:szCs w:val="24"/>
               </w:rPr>
-              <w:t xml:space="preserve">Filiais</w:t>
+              <w:t xml:space="preserve">Vitrine e detalhe</w:t>
             </w:r>
           </w:p>
         </w:tc>
@@ -2291,7 +2861,7 @@
                 <w:sz w:val="24"/>
                 <w:szCs w:val="24"/>
               </w:rPr>
-              <w:t xml:space="preserve">CRUD de pontos de venda e estoque</w:t>
+              <w:t xml:space="preserve">Produtos de um quiosque e adição ao carrinho</w:t>
             </w:r>
           </w:p>
         </w:tc>
@@ -2312,7 +2882,7 @@
                 <w:sz w:val="24"/>
                 <w:szCs w:val="24"/>
               </w:rPr>
-              <w:t xml:space="preserve">FormasPagamento</w:t>
+              <w:t xml:space="preserve">Reservas</w:t>
             </w:r>
           </w:p>
         </w:tc>
@@ -2331,7 +2901,7 @@
                 <w:sz w:val="24"/>
                 <w:szCs w:val="24"/>
               </w:rPr>
-              <w:t xml:space="preserve">Pagamentos</w:t>
+              <w:t xml:space="preserve">Carrinho</w:t>
             </w:r>
           </w:p>
         </w:tc>
@@ -2350,7 +2920,7 @@
                 <w:sz w:val="24"/>
                 <w:szCs w:val="24"/>
               </w:rPr>
-              <w:t xml:space="preserve">CRUD de formas salvas</w:t>
+              <w:t xml:space="preserve">Itens, endereço e finalização do pedido</w:t>
             </w:r>
           </w:p>
         </w:tc>
@@ -2371,7 +2941,7 @@
                 <w:sz w:val="24"/>
                 <w:szCs w:val="24"/>
               </w:rPr>
-              <w:t xml:space="preserve">Configuracoes</w:t>
+              <w:t xml:space="preserve">Pedidos / PedidoAcompanhamento</w:t>
             </w:r>
           </w:p>
         </w:tc>
@@ -2390,6 +2960,124 @@
                 <w:sz w:val="24"/>
                 <w:szCs w:val="24"/>
               </w:rPr>
+              <w:t xml:space="preserve">Pedidos</w:t>
+            </w:r>
+          </w:p>
+        </w:tc>
+        <w:tc>
+          <w:tcPr>
+            <w:tcW w:type="pct" w:w="33.333333333333336%"/>
+          </w:tcPr>
+          <w:p>
+            <w:pPr>
+              <w:spacing w:after="0" w:line="360"/>
+              <w:jc w:val="both"/>
+            </w:pPr>
+            <w:r>
+              <w:rPr>
+                <w:rFonts w:ascii="Times New Roman" w:cs="Times New Roman" w:eastAsia="Times New Roman" w:hAnsi="Times New Roman"/>
+                <w:sz w:val="24"/>
+                <w:szCs w:val="24"/>
+              </w:rPr>
+              <w:t xml:space="preserve">Histórico e acompanhamento</w:t>
+            </w:r>
+          </w:p>
+        </w:tc>
+      </w:tr>
+      <w:tr>
+        <w:tc>
+          <w:tcPr>
+            <w:tcW w:type="pct" w:w="33.333333333333336%"/>
+          </w:tcPr>
+          <w:p>
+            <w:pPr>
+              <w:spacing w:after="0" w:line="360"/>
+              <w:jc w:val="both"/>
+            </w:pPr>
+            <w:r>
+              <w:rPr>
+                <w:rFonts w:ascii="Times New Roman" w:cs="Times New Roman" w:eastAsia="Times New Roman" w:hAnsi="Times New Roman"/>
+                <w:sz w:val="24"/>
+                <w:szCs w:val="24"/>
+              </w:rPr>
+              <w:t xml:space="preserve">ClienteQuiosques / ClienteQuiosqueForm</w:t>
+            </w:r>
+          </w:p>
+        </w:tc>
+        <w:tc>
+          <w:tcPr>
+            <w:tcW w:type="pct" w:w="33.333333333333336%"/>
+          </w:tcPr>
+          <w:p>
+            <w:pPr>
+              <w:spacing w:after="0" w:line="360"/>
+              <w:jc w:val="both"/>
+            </w:pPr>
+            <w:r>
+              <w:rPr>
+                <w:rFonts w:ascii="Times New Roman" w:cs="Times New Roman" w:eastAsia="Times New Roman" w:hAnsi="Times New Roman"/>
+                <w:sz w:val="24"/>
+                <w:szCs w:val="24"/>
+              </w:rPr>
+              <w:t xml:space="preserve">Quiosques</w:t>
+            </w:r>
+          </w:p>
+        </w:tc>
+        <w:tc>
+          <w:tcPr>
+            <w:tcW w:type="pct" w:w="33.333333333333336%"/>
+          </w:tcPr>
+          <w:p>
+            <w:pPr>
+              <w:spacing w:after="0" w:line="360"/>
+              <w:jc w:val="both"/>
+            </w:pPr>
+            <w:r>
+              <w:rPr>
+                <w:rFonts w:ascii="Times New Roman" w:cs="Times New Roman" w:eastAsia="Times New Roman" w:hAnsi="Times New Roman"/>
+                <w:sz w:val="24"/>
+                <w:szCs w:val="24"/>
+              </w:rPr>
+              <w:t xml:space="preserve">Quiosques próprios montados com as compras recebidas</w:t>
+            </w:r>
+          </w:p>
+        </w:tc>
+      </w:tr>
+      <w:tr>
+        <w:tc>
+          <w:tcPr>
+            <w:tcW w:type="pct" w:w="33.333333333333336%"/>
+          </w:tcPr>
+          <w:p>
+            <w:pPr>
+              <w:spacing w:after="0" w:line="360"/>
+              <w:jc w:val="both"/>
+            </w:pPr>
+            <w:r>
+              <w:rPr>
+                <w:rFonts w:ascii="Times New Roman" w:cs="Times New Roman" w:eastAsia="Times New Roman" w:hAnsi="Times New Roman"/>
+                <w:sz w:val="24"/>
+                <w:szCs w:val="24"/>
+              </w:rPr>
+              <w:t xml:space="preserve">Perfil / Configuracoes / Enderecos / FormasPagamento</w:t>
+            </w:r>
+          </w:p>
+        </w:tc>
+        <w:tc>
+          <w:tcPr>
+            <w:tcW w:type="pct" w:w="33.333333333333336%"/>
+          </w:tcPr>
+          <w:p>
+            <w:pPr>
+              <w:spacing w:after="0" w:line="360"/>
+              <w:jc w:val="both"/>
+            </w:pPr>
+            <w:r>
+              <w:rPr>
+                <w:rFonts w:ascii="Times New Roman" w:cs="Times New Roman" w:eastAsia="Times New Roman" w:hAnsi="Times New Roman"/>
+                <w:sz w:val="24"/>
+                <w:szCs w:val="24"/>
+              </w:rPr>
               <w:t xml:space="preserve">Perfil</w:t>
             </w:r>
           </w:p>
@@ -2409,66 +3097,7 @@
                 <w:sz w:val="24"/>
                 <w:szCs w:val="24"/>
               </w:rPr>
-              <w:t xml:space="preserve">Edição de usuário e empresa</w:t>
-            </w:r>
-          </w:p>
-        </w:tc>
-      </w:tr>
-      <w:tr>
-        <w:tc>
-          <w:tcPr>
-            <w:tcW w:type="pct" w:w="33.333333333333336%"/>
-          </w:tcPr>
-          <w:p>
-            <w:pPr>
-              <w:spacing w:after="0" w:line="360"/>
-              <w:jc w:val="both"/>
-            </w:pPr>
-            <w:r>
-              <w:rPr>
-                <w:rFonts w:ascii="Times New Roman" w:cs="Times New Roman" w:eastAsia="Times New Roman" w:hAnsi="Times New Roman"/>
-                <w:sz w:val="24"/>
-                <w:szCs w:val="24"/>
-              </w:rPr>
-              <w:t xml:space="preserve">Cards</w:t>
-            </w:r>
-          </w:p>
-        </w:tc>
-        <w:tc>
-          <w:tcPr>
-            <w:tcW w:type="pct" w:w="33.333333333333336%"/>
-          </w:tcPr>
-          <w:p>
-            <w:pPr>
-              <w:spacing w:after="0" w:line="360"/>
-              <w:jc w:val="both"/>
-            </w:pPr>
-            <w:r>
-              <w:rPr>
-                <w:rFonts w:ascii="Times New Roman" w:cs="Times New Roman" w:eastAsia="Times New Roman" w:hAnsi="Times New Roman"/>
-                <w:sz w:val="24"/>
-                <w:szCs w:val="24"/>
-              </w:rPr>
-              <w:t xml:space="preserve">Financeiro</w:t>
-            </w:r>
-          </w:p>
-        </w:tc>
-        <w:tc>
-          <w:tcPr>
-            <w:tcW w:type="pct" w:w="33.333333333333336%"/>
-          </w:tcPr>
-          <w:p>
-            <w:pPr>
-              <w:spacing w:after="0" w:line="360"/>
-              <w:jc w:val="both"/>
-            </w:pPr>
-            <w:r>
-              <w:rPr>
-                <w:rFonts w:ascii="Times New Roman" w:cs="Times New Roman" w:eastAsia="Times New Roman" w:hAnsi="Times New Roman"/>
-                <w:sz w:val="24"/>
-                <w:szCs w:val="24"/>
-              </w:rPr>
-              <w:t xml:space="preserve">Estatísticas via API (aba mock em Carteira)</w:t>
+              <w:t xml:space="preserve">Dados, endereços e pagamentos</w:t>
             </w:r>
           </w:p>
         </w:tc>
@@ -2515,7 +3144,7 @@
           <w:sz w:val="24"/>
           <w:szCs w:val="24"/>
         </w:rPr>
-        <w:t xml:space="preserve">O ScreenHeader padroniza o cabeçalho autenticado (menu hambúrguer, calendário, notificações e sacola). A saudação e o calendário aparecem apenas na Home. O BottomTabBar customizado oferece sete ações e botão central (+) para cadastro de produtos. O menu lateral (HamburgerButton) abre modal com Barraquinhas, Formas de pagamento, Configurações e Sair.</w:t>
+        <w:t xml:space="preserve">Os dois perfis seguem o mesmo layout: cabeçalho sólido na cor do perfil, com cantos inferiores arredondados, logo, título e subtítulo; cards brancos; botões em formato pílula; e barra inferior preenchida na cor do perfil, com ícones brancos. O Cliente usa amarelo (#F8B125, CLIENTE_COLORS) e o Fornecedor usa azul-marinho (#123B6D, COMPANY_COLORS). No Fornecedor, o ScreenHeader monta o cabeçalho das abas principais (menu, logo, notificações e saudação na Home), o BackTitleHeader monta o das telas internas (voltar e título) e o TabScreenLayout reúne cabeçalho e conteúdo. O BottomTabBar mostra cinco abas para o Fornecedor (Início, Quiosques, Produtos, Vendas e Ajustes) e delega ao ClienteTabBar as seis abas do Cliente (Início, Produtos, Carrinho, Pedidos, Quiosques e Perfil). O menu lateral do Fornecedor (HamburgerButton) abre Início, Quiosques, Endereços, Configurações e Sair.</w:t>
       </w:r>
     </w:p>
     <w:p>
@@ -2612,6 +3241,326 @@
     </w:p>
     <w:p>
       <w:pPr>
+        <w:pStyle w:val="Heading3"/>
+        <w:spacing w:after="160" w:line="360"/>
+        <w:jc w:val="left"/>
+      </w:pPr>
+      <w:r>
+        <w:rPr>
+          <w:rFonts w:ascii="Times New Roman" w:cs="Times New Roman" w:eastAsia="Times New Roman" w:hAnsi="Times New Roman"/>
+          <w:sz w:val="24"/>
+          <w:szCs w:val="24"/>
+        </w:rPr>
+        <w:t xml:space="preserve">3.1.6 Quiosques do cliente</w:t>
+      </w:r>
+    </w:p>
+    <w:p>
+      <w:pPr>
+        <w:spacing w:after="120" w:line="360"/>
+        <w:ind w:firstLine="709"/>
+        <w:jc w:val="both"/>
+      </w:pPr>
+      <w:r>
+        <w:rPr>
+          <w:rFonts w:ascii="Times New Roman" w:cs="Times New Roman" w:eastAsia="Times New Roman" w:hAnsi="Times New Roman"/>
+          <w:sz w:val="24"/>
+          <w:szCs w:val="24"/>
+        </w:rPr>
+        <w:t xml:space="preserve">O cliente pode montar quiosques próprios para vender em eventos, usando como estoque o que comprou e recebeu pelo app. A funcionalidade foi feita só no aplicativo, reaproveitando a API existente: os quiosques são gravados em /api/barracas com o empresaId do cliente, e o estoque disponível vem dos produtos da empresa do cliente (ProductsContext), que o backend preenche quando um pedido é entregue.</w:t>
+      </w:r>
+    </w:p>
+    <w:tbl>
+      <w:tblPr>
+        <w:tblW w:type="pct" w:w="100%"/>
+        <w:tblBorders>
+          <w:top w:val="single" w:color="auto" w:sz="4"/>
+          <w:left w:val="single" w:color="auto" w:sz="4"/>
+          <w:bottom w:val="single" w:color="auto" w:sz="4"/>
+          <w:right w:val="single" w:color="auto" w:sz="4"/>
+          <w:insideH w:val="single" w:color="auto" w:sz="4"/>
+          <w:insideV w:val="single" w:color="auto" w:sz="4"/>
+        </w:tblBorders>
+      </w:tblPr>
+      <w:tblGrid>
+        <w:gridCol w:w="100"/>
+        <w:gridCol w:w="100"/>
+      </w:tblGrid>
+      <w:tr>
+        <w:tc>
+          <w:tcPr>
+            <w:tcW w:type="pct" w:w="50%"/>
+          </w:tcPr>
+          <w:p>
+            <w:pPr>
+              <w:spacing w:after="0" w:line="360"/>
+              <w:jc w:val="both"/>
+            </w:pPr>
+            <w:r>
+              <w:rPr>
+                <w:rFonts w:ascii="Times New Roman" w:cs="Times New Roman" w:eastAsia="Times New Roman" w:hAnsi="Times New Roman"/>
+                <w:b/>
+                <w:bCs/>
+                <w:sz w:val="24"/>
+                <w:szCs w:val="24"/>
+              </w:rPr>
+              <w:t xml:space="preserve">Regra</w:t>
+            </w:r>
+          </w:p>
+        </w:tc>
+        <w:tc>
+          <w:tcPr>
+            <w:tcW w:type="pct" w:w="50%"/>
+          </w:tcPr>
+          <w:p>
+            <w:pPr>
+              <w:spacing w:after="0" w:line="360"/>
+              <w:jc w:val="both"/>
+            </w:pPr>
+            <w:r>
+              <w:rPr>
+                <w:rFonts w:ascii="Times New Roman" w:cs="Times New Roman" w:eastAsia="Times New Roman" w:hAnsi="Times New Roman"/>
+                <w:b/>
+                <w:bCs/>
+                <w:sz w:val="24"/>
+                <w:szCs w:val="24"/>
+              </w:rPr>
+              <w:t xml:space="preserve">Como funciona</w:t>
+            </w:r>
+          </w:p>
+        </w:tc>
+      </w:tr>
+      <w:tr>
+        <w:tc>
+          <w:tcPr>
+            <w:tcW w:type="pct" w:w="50%"/>
+          </w:tcPr>
+          <w:p>
+            <w:pPr>
+              <w:spacing w:after="0" w:line="360"/>
+              <w:jc w:val="both"/>
+            </w:pPr>
+            <w:r>
+              <w:rPr>
+                <w:rFonts w:ascii="Times New Roman" w:cs="Times New Roman" w:eastAsia="Times New Roman" w:hAnsi="Times New Roman"/>
+                <w:sz w:val="24"/>
+                <w:szCs w:val="24"/>
+              </w:rPr>
+              <w:t xml:space="preserve">Divisão do estoque</w:t>
+            </w:r>
+          </w:p>
+        </w:tc>
+        <w:tc>
+          <w:tcPr>
+            <w:tcW w:type="pct" w:w="50%"/>
+          </w:tcPr>
+          <w:p>
+            <w:pPr>
+              <w:spacing w:after="0" w:line="360"/>
+              <w:jc w:val="both"/>
+            </w:pPr>
+            <w:r>
+              <w:rPr>
+                <w:rFonts w:ascii="Times New Roman" w:cs="Times New Roman" w:eastAsia="Times New Roman" w:hAnsi="Times New Roman"/>
+                <w:sz w:val="24"/>
+                <w:szCs w:val="24"/>
+              </w:rPr>
+              <w:t xml:space="preserve">A soma de um produto em todos os quiosques não pode passar do estoque comprado. Disponível = estoque − quantidade nos outros quiosques.</w:t>
+            </w:r>
+          </w:p>
+        </w:tc>
+      </w:tr>
+      <w:tr>
+        <w:tc>
+          <w:tcPr>
+            <w:tcW w:type="pct" w:w="50%"/>
+          </w:tcPr>
+          <w:p>
+            <w:pPr>
+              <w:spacing w:after="0" w:line="360"/>
+              <w:jc w:val="both"/>
+            </w:pPr>
+            <w:r>
+              <w:rPr>
+                <w:rFonts w:ascii="Times New Roman" w:cs="Times New Roman" w:eastAsia="Times New Roman" w:hAnsi="Times New Roman"/>
+                <w:sz w:val="24"/>
+                <w:szCs w:val="24"/>
+              </w:rPr>
+              <w:t xml:space="preserve">Preço de venda</w:t>
+            </w:r>
+          </w:p>
+        </w:tc>
+        <w:tc>
+          <w:tcPr>
+            <w:tcW w:type="pct" w:w="50%"/>
+          </w:tcPr>
+          <w:p>
+            <w:pPr>
+              <w:spacing w:after="0" w:line="360"/>
+              <w:jc w:val="both"/>
+            </w:pPr>
+            <w:r>
+              <w:rPr>
+                <w:rFonts w:ascii="Times New Roman" w:cs="Times New Roman" w:eastAsia="Times New Roman" w:hAnsi="Times New Roman"/>
+                <w:sz w:val="24"/>
+                <w:szCs w:val="24"/>
+              </w:rPr>
+              <w:t xml:space="preserve">Informado pelo cliente para cada produto com quantidade; gravado no produto (vale para todos os quiosques dele).</w:t>
+            </w:r>
+          </w:p>
+        </w:tc>
+      </w:tr>
+      <w:tr>
+        <w:tc>
+          <w:tcPr>
+            <w:tcW w:type="pct" w:w="50%"/>
+          </w:tcPr>
+          <w:p>
+            <w:pPr>
+              <w:spacing w:after="0" w:line="360"/>
+              <w:jc w:val="both"/>
+            </w:pPr>
+            <w:r>
+              <w:rPr>
+                <w:rFonts w:ascii="Times New Roman" w:cs="Times New Roman" w:eastAsia="Times New Roman" w:hAnsi="Times New Roman"/>
+                <w:sz w:val="24"/>
+                <w:szCs w:val="24"/>
+              </w:rPr>
+              <w:t xml:space="preserve">Preço pago (referência)</w:t>
+            </w:r>
+          </w:p>
+        </w:tc>
+        <w:tc>
+          <w:tcPr>
+            <w:tcW w:type="pct" w:w="50%"/>
+          </w:tcPr>
+          <w:p>
+            <w:pPr>
+              <w:spacing w:after="0" w:line="360"/>
+              <w:jc w:val="both"/>
+            </w:pPr>
+            <w:r>
+              <w:rPr>
+                <w:rFonts w:ascii="Times New Roman" w:cs="Times New Roman" w:eastAsia="Times New Roman" w:hAnsi="Times New Roman"/>
+                <w:sz w:val="24"/>
+                <w:szCs w:val="24"/>
+              </w:rPr>
+              <w:t xml:space="preserve">Preço unitário do pedido entregue mais recente com item de mesmo nome; não aparece se não houver correspondência.</w:t>
+            </w:r>
+          </w:p>
+        </w:tc>
+      </w:tr>
+      <w:tr>
+        <w:tc>
+          <w:tcPr>
+            <w:tcW w:type="pct" w:w="50%"/>
+          </w:tcPr>
+          <w:p>
+            <w:pPr>
+              <w:spacing w:after="0" w:line="360"/>
+              <w:jc w:val="both"/>
+            </w:pPr>
+            <w:r>
+              <w:rPr>
+                <w:rFonts w:ascii="Times New Roman" w:cs="Times New Roman" w:eastAsia="Times New Roman" w:hAnsi="Times New Roman"/>
+                <w:sz w:val="24"/>
+                <w:szCs w:val="24"/>
+              </w:rPr>
+              <w:t xml:space="preserve">Validação</w:t>
+            </w:r>
+          </w:p>
+        </w:tc>
+        <w:tc>
+          <w:tcPr>
+            <w:tcW w:type="pct" w:w="50%"/>
+          </w:tcPr>
+          <w:p>
+            <w:pPr>
+              <w:spacing w:after="0" w:line="360"/>
+              <w:jc w:val="both"/>
+            </w:pPr>
+            <w:r>
+              <w:rPr>
+                <w:rFonts w:ascii="Times New Roman" w:cs="Times New Roman" w:eastAsia="Times New Roman" w:hAnsi="Times New Roman"/>
+                <w:sz w:val="24"/>
+                <w:szCs w:val="24"/>
+              </w:rPr>
+              <w:t xml:space="preserve">Nome obrigatório, ao menos um produto, quantidade dentro do disponível e preço maior que zero quando há quantidade.</w:t>
+            </w:r>
+          </w:p>
+        </w:tc>
+      </w:tr>
+      <w:tr>
+        <w:tc>
+          <w:tcPr>
+            <w:tcW w:type="pct" w:w="50%"/>
+          </w:tcPr>
+          <w:p>
+            <w:pPr>
+              <w:spacing w:after="0" w:line="360"/>
+              <w:jc w:val="both"/>
+            </w:pPr>
+            <w:r>
+              <w:rPr>
+                <w:rFonts w:ascii="Times New Roman" w:cs="Times New Roman" w:eastAsia="Times New Roman" w:hAnsi="Times New Roman"/>
+                <w:sz w:val="24"/>
+                <w:szCs w:val="24"/>
+              </w:rPr>
+              <w:t xml:space="preserve">Aviso</w:t>
+            </w:r>
+          </w:p>
+        </w:tc>
+        <w:tc>
+          <w:tcPr>
+            <w:tcW w:type="pct" w:w="50%"/>
+          </w:tcPr>
+          <w:p>
+            <w:pPr>
+              <w:spacing w:after="0" w:line="360"/>
+              <w:jc w:val="both"/>
+            </w:pPr>
+            <w:r>
+              <w:rPr>
+                <w:rFonts w:ascii="Times New Roman" w:cs="Times New Roman" w:eastAsia="Times New Roman" w:hAnsi="Times New Roman"/>
+                <w:sz w:val="24"/>
+                <w:szCs w:val="24"/>
+              </w:rPr>
+              <w:t xml:space="preserve">A lista sinaliza 'Estoque acima do disponível' quando um quiosque passa do que o cliente tem.</w:t>
+            </w:r>
+          </w:p>
+        </w:tc>
+      </w:tr>
+    </w:tbl>
+    <w:p>
+      <w:pPr>
+        <w:spacing w:after="200" w:line="360"/>
+        <w:jc w:val="both"/>
+      </w:pPr>
+      <w:r>
+        <w:rPr>
+          <w:rFonts w:ascii="Times New Roman" w:cs="Times New Roman" w:eastAsia="Times New Roman" w:hAnsi="Times New Roman"/>
+          <w:sz w:val="24"/>
+          <w:szCs w:val="24"/>
+        </w:rPr>
+        <w:t xml:space="preserve"/>
+      </w:r>
+    </w:p>
+    <w:p>
+      <w:pPr>
+        <w:spacing w:after="120" w:line="360"/>
+        <w:ind w:firstLine="709"/>
+        <w:jc w:val="both"/>
+      </w:pPr>
+      <w:r>
+        <w:rPr>
+          <w:rFonts w:ascii="Times New Roman" w:cs="Times New Roman" w:eastAsia="Times New Roman" w:hAnsi="Times New Roman"/>
+          <w:sz w:val="24"/>
+          <w:szCs w:val="24"/>
+        </w:rPr>
+        <w:t xml:space="preserve">As regras ficam em src/utils/estoqueQuiosque.ts, como funções puras, cobertas por 22 testes unitários (Jest). Duas premissas dependem do backend e não foram validadas sem o servidor: que os itens de pedidos entregues viram produtos da empresa compradora, com estoque, e que /api/barracas aceita quiosques de empresas do tipo cliente.</w:t>
+      </w:r>
+    </w:p>
+    <w:p>
+      <w:pPr>
         <w:pStyle w:val="Heading2"/>
         <w:spacing w:after="200" w:line="360"/>
         <w:jc w:val="left"/>
@@ -2682,7 +3631,7 @@
           <w:sz w:val="24"/>
           <w:szCs w:val="24"/>
         </w:rPr>
-        <w:t xml:space="preserve">• Service: regras de negócio (marketplace, compras, barraquinhas, JWT)</w:t>
+        <w:t xml:space="preserve">• Service: regras de negócio (marketplace, compras, quiosques, JWT)</w:t>
       </w:r>
     </w:p>
     <w:p>
@@ -2946,7 +3895,7 @@
                 <w:sz w:val="24"/>
                 <w:szCs w:val="24"/>
               </w:rPr>
-              <w:t xml:space="preserve">Barraquinhas</w:t>
+              <w:t xml:space="preserve">Quiosque</w:t>
             </w:r>
           </w:p>
         </w:tc>
@@ -3445,7 +4394,7 @@
           <w:sz w:val="24"/>
           <w:szCs w:val="24"/>
         </w:rPr>
-        <w:t xml:space="preserve">• Barraquinha: cria evento padrão Operação principal se inexistente; estoque sincronizado por produto da empresa.</w:t>
+        <w:t xml:space="preserve">• Quiosque: cria evento padrão Operação principal se inexistente; estoque sincronizado por produto da empresa.</w:t>
       </w:r>
     </w:p>
     <w:p>
@@ -3520,7 +4469,7 @@
           <w:sz w:val="24"/>
           <w:szCs w:val="24"/>
         </w:rPr>
-        <w:t xml:space="preserve">O modelo conceitual representa entidades e relacionamentos em linguagem de negócio, independente de tipos físicos. Três domínios se destacam: (1) Cadastro — Perfil, Empresa, Usuário; (2) Operação presencial (PDV) — Evento, Barraquinha, Estoque, Pedido, Item e Pagamento; (3) Marketplace B2B — Produto, Solicitação de Compra, Item de Solicitação, Endereço de Entrega e Forma de Pagamento Salva.</w:t>
+        <w:t xml:space="preserve">O modelo conceitual representa entidades e relacionamentos em linguagem de negócio, independente de tipos físicos. Três domínios se destacam: (1) Cadastro — Perfil, Empresa, Usuário; (2) Operação presencial (PDV) — Evento, Quiosque, Estoque, Pedido, Item e Pagamento; (3) Marketplace B2B — Produto, Solicitação de Compra, Item de Solicitação, Endereço de Entrega e Forma de Pagamento Salva.</w:t>
       </w:r>
     </w:p>
     <w:p>
@@ -3793,7 +4742,7 @@
                 <w:sz w:val="24"/>
                 <w:szCs w:val="24"/>
               </w:rPr>
-              <w:t xml:space="preserve">PDV / Barraquinhas</w:t>
+              <w:t xml:space="preserve">PDV / Quiosque</w:t>
             </w:r>
           </w:p>
         </w:tc>
@@ -7711,7 +8660,7 @@
                 <w:sz w:val="24"/>
                 <w:szCs w:val="24"/>
               </w:rPr>
-              <w:t xml:space="preserve">Identificador da barraquinha</w:t>
+              <w:t xml:space="preserve">Identificador do quiosque</w:t>
             </w:r>
           </w:p>
         </w:tc>
@@ -8314,7 +9263,7 @@
                 <w:sz w:val="24"/>
                 <w:szCs w:val="24"/>
               </w:rPr>
-              <w:t xml:space="preserve">Barraquinha</w:t>
+              <w:t xml:space="preserve">Quiosque</w:t>
             </w:r>
           </w:p>
         </w:tc>
@@ -8626,7 +9575,7 @@
                 <w:sz w:val="24"/>
                 <w:szCs w:val="24"/>
               </w:rPr>
-              <w:t xml:space="preserve">Um produto por barraquinha</w:t>
+              <w:t xml:space="preserve">Um produto por quiosque</w:t>
             </w:r>
           </w:p>
         </w:tc>
@@ -8917,7 +9866,7 @@
                 <w:sz w:val="24"/>
                 <w:szCs w:val="24"/>
               </w:rPr>
-              <w:t xml:space="preserve">Barraquinha de origem</w:t>
+              <w:t xml:space="preserve">Quiosque de origem</w:t>
             </w:r>
           </w:p>
         </w:tc>
@@ -13518,7 +14467,7 @@
           <w:sz w:val="24"/>
           <w:szCs w:val="24"/>
         </w:rPr>
-        <w:t xml:space="preserve">O QuickStock entrega uma solução funcional de gestão de estoque e marketplace B2B, integrando aplicativo mobile Expo, API Spring Boot e banco PostgreSQL. Foram implementados cadastro unificado, CRUD de produtos e barraquinhas, fluxo completo de compra (vitrine → sacola → pedido → acompanhamento), configurações de perfil, formas de pagamento e notificações.</w:t>
+        <w:t xml:space="preserve">O QuickStock entrega uma solução funcional de gestão de estoque e marketplace B2B, integrando aplicativo mobile Expo, API Spring Boot e banco PostgreSQL. Foram implementados cadastro unificado com perfis Cliente e Fornecedor, CRUD de produtos e quiosques, quiosques do cliente montados a partir das compras recebidas, fluxo completo de compra (vitrine → sacola → pedido → acompanhamento), configurações de perfil, formas de pagamento e notificações, com identidade visual consistente entre os perfis.</w:t>
       </w:r>
     </w:p>
     <w:p>
@@ -13533,7 +14482,7 @@
           <w:sz w:val="24"/>
           <w:szCs w:val="24"/>
         </w:rPr>
-        <w:t xml:space="preserve">Como limitações conhecidas, destacam-se: autenticação JWT parcial (sem filtro global), dados mock na Home e aba Carteira do app, notificações geradas em tempo real sem tabela dedicada e resumo financeiro parcialmente sintético no backend. Trabalhos futuros incluem Spring Security completo, testes automatizados, push notifications e eliminação de dados mock.</w:t>
+        <w:t xml:space="preserve">Como limitações conhecidas, destacam-se: autenticação JWT parcial (sem filtro global), dados mock na Home e aba Carteira do app, notificações geradas em tempo real sem tabela dedicada, resumo financeiro parcialmente sintético no backend e quiosques do cliente dependentes de o backend lançar as compras entregues no estoque do comprador. Trabalhos futuros incluem Spring Security completo, ampliação dos testes automatizados, push notifications e eliminação de dados mock.</w:t>
       </w:r>
     </w:p>
     <w:p>

</xml_diff>